<commit_message>
Update calibration report units and repair workflow
</commit_message>
<xml_diff>
--- a/static/templates/calibration-report/calibration-report-template.docx
+++ b/static/templates/calibration-report/calibration-report-template.docx
@@ -3868,7 +3868,7 @@
               <w:rPr>
                 <w:rFonts w:asciiTheme="majorHAnsi" w:hAnsiTheme="majorHAnsi"/>
               </w:rPr>
-              <w:t>m</w:t>
+              <w:t>u</w:t>
             </w:r>
             <w:r>
               <w:rPr>
@@ -3997,7 +3997,7 @@
               <w:rPr>
                 <w:rFonts w:asciiTheme="majorHAnsi" w:hAnsiTheme="majorHAnsi"/>
               </w:rPr>
-              <w:t>(sec)</w:t>
+              <w:t>(msec)</w:t>
             </w:r>
           </w:p>
         </w:tc>
@@ -4570,7 +4570,7 @@
               <w:rPr>
                 <w:rFonts w:asciiTheme="majorHAnsi" w:hAnsiTheme="majorHAnsi"/>
               </w:rPr>
-              <w:t>0</w:t>
+              <w:t>2</w:t>
             </w:r>
           </w:p>
         </w:tc>
@@ -4742,7 +4742,7 @@
               <w:rPr>
                 <w:rFonts w:asciiTheme="majorHAnsi" w:hAnsiTheme="majorHAnsi"/>
               </w:rPr>
-              <w:t>m</w:t>
+              <w:t>u</w:t>
             </w:r>
             <w:r>
               <w:rPr>

</xml_diff>